<commit_message>
Update lab2 instructions document.
</commit_message>
<xml_diff>
--- a/Week2/Lab2/Lab2_instructions.docx
+++ b/Week2/Lab2/Lab2_instructions.docx
@@ -1086,7 +1086,21 @@
           <w:rFonts w:hint="eastAsia"/>
           <w:lang w:eastAsia="ko-KR"/>
         </w:rPr>
-        <w:t xml:space="preserve">A - </w:t>
+        <w:t xml:space="preserve">A </w:t>
+      </w:r>
+      <w:r>
+        <w:rPr>
+          <w:rFonts w:hint="eastAsia"/>
+          <w:lang w:eastAsia="ko-KR"/>
+        </w:rPr>
+        <w:t>준비,</w:t>
+      </w:r>
+      <w:r>
+        <w:rPr>
+          <w:rFonts w:hint="eastAsia"/>
+          <w:lang w:eastAsia="ko-KR"/>
+        </w:rPr>
+        <w:t xml:space="preserve"> </w:t>
       </w:r>
       <w:r>
         <w:rPr>
@@ -2060,7 +2074,20 @@
         <w:rPr>
           <w:lang w:eastAsia="ko-KR"/>
         </w:rPr>
-        <w:t>4. UNOBSERVED, 권한 오류 또는 matched pairs=0이면 오류를 적고 2분 안에 예제 분석으로 전환한다. 이 경우 “제공 예제 분석”으로 표시한다.</w:t>
+        <w:t xml:space="preserve">4. UNOBSERVED, 권한 오류 또는 matched pairs=0이면 예제 분석으로 </w:t>
+      </w:r>
+      <w:r>
+        <w:rPr>
+          <w:rFonts w:hint="eastAsia"/>
+          <w:lang w:eastAsia="ko-KR"/>
+        </w:rPr>
+        <w:t>대신</w:t>
+      </w:r>
+      <w:r>
+        <w:rPr>
+          <w:lang w:eastAsia="ko-KR"/>
+        </w:rPr>
+        <w:t xml:space="preserve">한다. </w:t>
       </w:r>
     </w:p>
     <w:p>
@@ -2093,7 +2120,6 @@
         <w:rPr>
           <w:lang w:eastAsia="ko-KR"/>
         </w:rPr>
-        <w:lastRenderedPageBreak/>
         <w:t>이벤트가 비었다는 이유만으로 interrupt가 없었다고 결론 내리지 않는다. WSL의 IRQ 종류와 번호는 PC 및 architecture에 따라 다르다. 다음 쪽에서 도우미가 무엇을 기록했는지 코드와 연결한다.</w:t>
       </w:r>
     </w:p>
@@ -2476,7 +2502,7 @@
           </mc:Choice>
           <mc:Fallback>
             <w:pict>
-              <v:rect w14:anchorId="4A3A0C51" id="직사각형 1" o:spid="_x0000_s1026" style="position:absolute;margin-left:0;margin-top:31.1pt;width:493.5pt;height:34.8pt;z-index:-251664896;visibility:visible;mso-wrap-style:square;mso-height-percent:0;mso-wrap-distance-left:9pt;mso-wrap-distance-top:0;mso-wrap-distance-right:9pt;mso-wrap-distance-bottom:0;mso-position-horizontal:absolute;mso-position-horizontal-relative:text;mso-position-vertical:absolute;mso-position-vertical-relative:text;mso-height-percent:0;mso-height-relative:margin;v-text-anchor:middle" o:gfxdata="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" fillcolor="white [3201]" strokecolor="black [3200]" strokeweight=".25pt"/>
+              <v:rect w14:anchorId="7B23038D" id="직사각형 1" o:spid="_x0000_s1026" style="position:absolute;margin-left:0;margin-top:31.1pt;width:493.5pt;height:34.8pt;z-index:-251664896;visibility:visible;mso-wrap-style:square;mso-height-percent:0;mso-wrap-distance-left:9pt;mso-wrap-distance-top:0;mso-wrap-distance-right:9pt;mso-wrap-distance-bottom:0;mso-position-horizontal:absolute;mso-position-horizontal-relative:text;mso-position-vertical:absolute;mso-position-vertical-relative:text;mso-height-percent:0;mso-height-relative:margin;v-text-anchor:middle" o:gfxdata="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" fillcolor="white [3201]" strokecolor="black [3200]" strokeweight=".25pt"/>
             </w:pict>
           </mc:Fallback>
         </mc:AlternateContent>
@@ -2602,7 +2628,7 @@
           </mc:Choice>
           <mc:Fallback>
             <w:pict>
-              <v:rect w14:anchorId="255A4D40" id="직사각형 1" o:spid="_x0000_s1026" style="position:absolute;margin-left:0;margin-top:.2pt;width:493.5pt;height:34.8pt;z-index:-251661824;visibility:visible;mso-wrap-style:square;mso-height-percent:0;mso-wrap-distance-left:9pt;mso-wrap-distance-top:0;mso-wrap-distance-right:9pt;mso-wrap-distance-bottom:0;mso-position-horizontal:absolute;mso-position-horizontal-relative:text;mso-position-vertical:absolute;mso-position-vertical-relative:text;mso-height-percent:0;mso-height-relative:margin;v-text-anchor:middle" o:gfxdata="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" fillcolor="white [3201]" strokecolor="black [3200]" strokeweight=".25pt"/>
+              <v:rect w14:anchorId="41C9FC81" id="직사각형 1" o:spid="_x0000_s1026" style="position:absolute;margin-left:0;margin-top:.2pt;width:493.5pt;height:34.8pt;z-index:-251661824;visibility:visible;mso-wrap-style:square;mso-height-percent:0;mso-wrap-distance-left:9pt;mso-wrap-distance-top:0;mso-wrap-distance-right:9pt;mso-wrap-distance-bottom:0;mso-position-horizontal:absolute;mso-position-horizontal-relative:text;mso-position-vertical:absolute;mso-position-vertical-relative:text;mso-height-percent:0;mso-height-relative:margin;v-text-anchor:middle" o:gfxdata="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" fillcolor="white [3201]" strokecolor="black [3200]" strokeweight=".25pt"/>
             </w:pict>
           </mc:Fallback>
         </mc:AlternateContent>
@@ -2709,7 +2735,7 @@
           </mc:Choice>
           <mc:Fallback>
             <w:pict>
-              <v:rect w14:anchorId="091122AF" id="직사각형 1" o:spid="_x0000_s1026" style="position:absolute;margin-left:-.2pt;margin-top:.5pt;width:494.55pt;height:34.8pt;z-index:-251657728;visibility:visible;mso-wrap-style:square;mso-width-percent:0;mso-height-percent:0;mso-wrap-distance-left:9pt;mso-wrap-distance-top:0;mso-wrap-distance-right:9pt;mso-wrap-distance-bottom:0;mso-position-horizontal:absolute;mso-position-horizontal-relative:text;mso-position-vertical:absolute;mso-position-vertical-relative:text;mso-width-percent:0;mso-height-percent:0;mso-width-relative:margin;mso-height-relative:margin;v-text-anchor:middle" o:gfxdata="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" fillcolor="white [3201]" strokecolor="black [3200]" strokeweight=".25pt"/>
+              <v:rect w14:anchorId="349FE6A1" id="직사각형 1" o:spid="_x0000_s1026" style="position:absolute;margin-left:-.2pt;margin-top:.5pt;width:494.55pt;height:34.8pt;z-index:-251657728;visibility:visible;mso-wrap-style:square;mso-width-percent:0;mso-height-percent:0;mso-wrap-distance-left:9pt;mso-wrap-distance-top:0;mso-wrap-distance-right:9pt;mso-wrap-distance-bottom:0;mso-position-horizontal:absolute;mso-position-horizontal-relative:text;mso-position-vertical:absolute;mso-position-vertical-relative:text;mso-width-percent:0;mso-height-percent:0;mso-width-relative:margin;mso-height-relative:margin;v-text-anchor:middle" o:gfxdata="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" fillcolor="white [3201]" strokecolor="black [3200]" strokeweight=".25pt"/>
             </w:pict>
           </mc:Fallback>
         </mc:AlternateContent>
@@ -4952,7 +4978,7 @@
           </mc:Choice>
           <mc:Fallback>
             <w:pict>
-              <v:rect w14:anchorId="2BD2A845" id="직사각형 1" o:spid="_x0000_s1026" style="position:absolute;margin-left:-.2pt;margin-top:31.35pt;width:494.6pt;height:34.8pt;z-index:-251655680;visibility:visible;mso-wrap-style:square;mso-width-percent:0;mso-height-percent:0;mso-wrap-distance-left:9pt;mso-wrap-distance-top:0;mso-wrap-distance-right:9pt;mso-wrap-distance-bottom:0;mso-position-horizontal:absolute;mso-position-horizontal-relative:text;mso-position-vertical:absolute;mso-position-vertical-relative:text;mso-width-percent:0;mso-height-percent:0;mso-width-relative:margin;mso-height-relative:margin;v-text-anchor:middle" o:gfxdata="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" fillcolor="white [3201]" strokecolor="black [3200]" strokeweight=".25pt"/>
+              <v:rect w14:anchorId="00E6ED17" id="직사각형 1" o:spid="_x0000_s1026" style="position:absolute;margin-left:-.2pt;margin-top:31.35pt;width:494.6pt;height:34.8pt;z-index:-251655680;visibility:visible;mso-wrap-style:square;mso-width-percent:0;mso-height-percent:0;mso-wrap-distance-left:9pt;mso-wrap-distance-top:0;mso-wrap-distance-right:9pt;mso-wrap-distance-bottom:0;mso-position-horizontal:absolute;mso-position-horizontal-relative:text;mso-position-vertical:absolute;mso-position-vertical-relative:text;mso-width-percent:0;mso-height-percent:0;mso-width-relative:margin;mso-height-relative:margin;v-text-anchor:middle" o:gfxdata="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" fillcolor="white [3201]" strokecolor="black [3200]" strokeweight=".25pt"/>
             </w:pict>
           </mc:Fallback>
         </mc:AlternateContent>
@@ -5066,7 +5092,7 @@
           </mc:Choice>
           <mc:Fallback>
             <w:pict>
-              <v:rect w14:anchorId="151D83D9" id="직사각형 1" o:spid="_x0000_s1026" style="position:absolute;margin-left:-.2pt;margin-top:23pt;width:493.5pt;height:34.8pt;z-index:-251653632;visibility:visible;mso-wrap-style:square;mso-width-percent:0;mso-height-percent:0;mso-wrap-distance-left:9pt;mso-wrap-distance-top:0;mso-wrap-distance-right:9pt;mso-wrap-distance-bottom:0;mso-position-horizontal:absolute;mso-position-horizontal-relative:text;mso-position-vertical:absolute;mso-position-vertical-relative:text;mso-width-percent:0;mso-height-percent:0;mso-width-relative:margin;mso-height-relative:margin;v-text-anchor:middle" o:gfxdata="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" fillcolor="white [3201]" strokecolor="black [3200]" strokeweight=".25pt"/>
+              <v:rect w14:anchorId="3A06524D" id="직사각형 1" o:spid="_x0000_s1026" style="position:absolute;margin-left:-.2pt;margin-top:23pt;width:493.5pt;height:34.8pt;z-index:-251653632;visibility:visible;mso-wrap-style:square;mso-width-percent:0;mso-height-percent:0;mso-wrap-distance-left:9pt;mso-wrap-distance-top:0;mso-wrap-distance-right:9pt;mso-wrap-distance-bottom:0;mso-position-horizontal:absolute;mso-position-horizontal-relative:text;mso-position-vertical:absolute;mso-position-vertical-relative:text;mso-width-percent:0;mso-height-percent:0;mso-width-relative:margin;mso-height-relative:margin;v-text-anchor:middle" o:gfxdata="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" fillcolor="white [3201]" strokecolor="black [3200]" strokeweight=".25pt"/>
             </w:pict>
           </mc:Fallback>
         </mc:AlternateContent>
@@ -5180,7 +5206,7 @@
           </mc:Choice>
           <mc:Fallback>
             <w:pict>
-              <v:rect w14:anchorId="3210C1D5" id="직사각형 1" o:spid="_x0000_s1026" style="position:absolute;margin-left:-.2pt;margin-top:23.15pt;width:493.45pt;height:34.8pt;z-index:-251651584;visibility:visible;mso-wrap-style:square;mso-width-percent:0;mso-height-percent:0;mso-wrap-distance-left:9pt;mso-wrap-distance-top:0;mso-wrap-distance-right:9pt;mso-wrap-distance-bottom:0;mso-position-horizontal:absolute;mso-position-horizontal-relative:text;mso-position-vertical:absolute;mso-position-vertical-relative:text;mso-width-percent:0;mso-height-percent:0;mso-width-relative:margin;mso-height-relative:margin;v-text-anchor:middle" o:gfxdata="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" fillcolor="white [3201]" strokecolor="black [3200]" strokeweight=".25pt"/>
+              <v:rect w14:anchorId="639FC1CB" id="직사각형 1" o:spid="_x0000_s1026" style="position:absolute;margin-left:-.2pt;margin-top:23.15pt;width:493.45pt;height:34.8pt;z-index:-251651584;visibility:visible;mso-wrap-style:square;mso-width-percent:0;mso-height-percent:0;mso-wrap-distance-left:9pt;mso-wrap-distance-top:0;mso-wrap-distance-right:9pt;mso-wrap-distance-bottom:0;mso-position-horizontal:absolute;mso-position-horizontal-relative:text;mso-position-vertical:absolute;mso-position-vertical-relative:text;mso-width-percent:0;mso-height-percent:0;mso-width-relative:margin;mso-height-relative:margin;v-text-anchor:middle" o:gfxdata="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" fillcolor="white [3201]" strokecolor="black [3200]" strokeweight=".25pt"/>
             </w:pict>
           </mc:Fallback>
         </mc:AlternateContent>
@@ -6105,7 +6131,19 @@
         <w:rPr>
           <w:highlight w:val="lightGray"/>
         </w:rPr>
-        <w:t>34  sa.sa_handler = SIG_DFL;</w:t>
+        <w:t xml:space="preserve">34  sa.sa_handler = </w:t>
+      </w:r>
+      <w:r>
+        <w:rPr>
+          <w:highlight w:val="green"/>
+        </w:rPr>
+        <w:t>SIG_DFL</w:t>
+      </w:r>
+      <w:r>
+        <w:rPr>
+          <w:highlight w:val="lightGray"/>
+        </w:rPr>
+        <w:t>;</w:t>
       </w:r>
     </w:p>
     <w:p>
@@ -6137,7 +6175,19 @@
         <w:rPr>
           <w:highlight w:val="lightGray"/>
         </w:rPr>
-        <w:t>35  if (!strcmp(argv[1], "ignore")) sa.sa_handler = SIG_IGN; /* KEY ignore */</w:t>
+        <w:t xml:space="preserve">35  if (!strcmp(argv[1], "ignore")) sa.sa_handler = </w:t>
+      </w:r>
+      <w:r>
+        <w:rPr>
+          <w:highlight w:val="green"/>
+        </w:rPr>
+        <w:t>SIG_IGN</w:t>
+      </w:r>
+      <w:r>
+        <w:rPr>
+          <w:highlight w:val="lightGray"/>
+        </w:rPr>
+        <w:t>; /* KEY ignore */</w:t>
       </w:r>
     </w:p>
     <w:p>
@@ -6156,7 +6206,19 @@
         <w:rPr>
           <w:highlight w:val="lightGray"/>
         </w:rPr>
-        <w:t xml:space="preserve"> 36  if (!strcmp(argv[1], "catch")) sa.sa_handler = on_term; /* KEY catch */</w:t>
+        <w:t xml:space="preserve"> 36  if (!strcmp(argv[1], "catch")) sa.sa_handler = </w:t>
+      </w:r>
+      <w:r>
+        <w:rPr>
+          <w:highlight w:val="green"/>
+        </w:rPr>
+        <w:t>on_term</w:t>
+      </w:r>
+      <w:r>
+        <w:rPr>
+          <w:highlight w:val="lightGray"/>
+        </w:rPr>
+        <w:t>; /* KEY catch */</w:t>
       </w:r>
     </w:p>
     <w:p>
@@ -6213,7 +6275,19 @@
         <w:rPr>
           <w:highlight w:val="lightGray"/>
         </w:rPr>
-        <w:t xml:space="preserve"> 40  check(sigprocmask(SIG_BLOCK, &amp;mask, NULL), "block SIGTERM"); /* KEY block */</w:t>
+        <w:t xml:space="preserve"> 40  check(sigprocmask(SIG_BLOCK, &amp;mask, NULL), "</w:t>
+      </w:r>
+      <w:r>
+        <w:rPr>
+          <w:highlight w:val="green"/>
+        </w:rPr>
+        <w:t>block SIGTERM</w:t>
+      </w:r>
+      <w:r>
+        <w:rPr>
+          <w:highlight w:val="lightGray"/>
+        </w:rPr>
+        <w:t>"); /* KEY block */</w:t>
       </w:r>
     </w:p>
     <w:p>
@@ -6301,21 +6375,135 @@
         <w:rPr>
           <w:lang w:eastAsia="ko-KR"/>
         </w:rPr>
-        <w:t>이 실습에서는 세 모드 모두 KILL로 종료된다. 이때 사용자 handler를 통한 정리 기회도 없다. 실제 시스템의 D 상태나 zombie 회수 문제까지 “항상 즉시 사라진다”로 일반화하지 않는다.</w:t>
-      </w:r>
-    </w:p>
-    <w:p>
-      <w:pPr>
-        <w:pStyle w:val="21"/>
-        <w:rPr>
-          <w:lang w:eastAsia="ko-KR"/>
-        </w:rPr>
-      </w:pPr>
-    </w:p>
-    <w:p>
-      <w:pPr>
-        <w:pStyle w:val="21"/>
-        <w:rPr>
+        <w:t xml:space="preserve">이 실습에서는 세 프로그램 모두 SIGKILL로 종료되고 PID가 사라진다. </w:t>
+      </w:r>
+      <w:r>
+        <w:rPr>
+          <w:lang w:eastAsia="ko-KR"/>
+        </w:rPr>
+        <w:t xml:space="preserve">이때 사용자 handler를 통한 정리 기회도 없다. </w:t>
+      </w:r>
+      <w:r>
+        <w:rPr>
+          <w:lang w:eastAsia="ko-KR"/>
+        </w:rPr>
+        <w:t>단, 실제 시스템에서는 프로세스 상태에 따라 PID가 잠시 남아 보일 수 있다.</w:t>
+      </w:r>
+    </w:p>
+    <w:p>
+      <w:pPr>
+        <w:ind w:leftChars="100" w:left="200"/>
+        <w:rPr>
+          <w:rFonts w:hint="eastAsia"/>
+          <w:sz w:val="18"/>
+          <w:szCs w:val="20"/>
+          <w:lang w:eastAsia="ko-KR"/>
+        </w:rPr>
+      </w:pPr>
+      <w:r>
+        <w:rPr>
+          <w:rFonts w:hint="eastAsia"/>
+          <w:sz w:val="18"/>
+          <w:szCs w:val="20"/>
+          <w:lang w:eastAsia="ko-KR"/>
+        </w:rPr>
+        <w:t xml:space="preserve">- </w:t>
+      </w:r>
+      <w:r>
+        <w:rPr>
+          <w:sz w:val="18"/>
+          <w:szCs w:val="20"/>
+          <w:lang w:eastAsia="ko-KR"/>
+        </w:rPr>
+        <w:t>D 상태: 프로세스가 커널 안에서 중단할 수 없는 I/O를 기다리는 상태</w:t>
+      </w:r>
+      <w:r>
+        <w:rPr>
+          <w:rFonts w:hint="eastAsia"/>
+          <w:sz w:val="18"/>
+          <w:szCs w:val="20"/>
+          <w:lang w:eastAsia="ko-KR"/>
+        </w:rPr>
+        <w:t>이다</w:t>
+      </w:r>
+      <w:r>
+        <w:rPr>
+          <w:sz w:val="18"/>
+          <w:szCs w:val="20"/>
+          <w:lang w:eastAsia="ko-KR"/>
+        </w:rPr>
+        <w:t>. SIGKILL이 pending 상태가 되어도, 커널 작업에서 빠져나오기 전에는 종료 처리가 진행되지 않을 수 있</w:t>
+      </w:r>
+      <w:r>
+        <w:rPr>
+          <w:rFonts w:hint="eastAsia"/>
+          <w:sz w:val="18"/>
+          <w:szCs w:val="20"/>
+          <w:lang w:eastAsia="ko-KR"/>
+        </w:rPr>
+        <w:t>다.</w:t>
+      </w:r>
+    </w:p>
+    <w:p>
+      <w:pPr>
+        <w:ind w:leftChars="100" w:left="200"/>
+        <w:rPr>
+          <w:sz w:val="18"/>
+          <w:szCs w:val="20"/>
+          <w:lang w:eastAsia="ko-KR"/>
+        </w:rPr>
+      </w:pPr>
+      <w:r>
+        <w:rPr>
+          <w:rFonts w:hint="eastAsia"/>
+          <w:sz w:val="18"/>
+          <w:szCs w:val="20"/>
+          <w:lang w:eastAsia="ko-KR"/>
+        </w:rPr>
+        <w:t xml:space="preserve">- </w:t>
+      </w:r>
+      <w:r>
+        <w:rPr>
+          <w:sz w:val="18"/>
+          <w:szCs w:val="20"/>
+          <w:lang w:eastAsia="ko-KR"/>
+        </w:rPr>
+        <w:t>Zombie 상태: 프로세스 실행은 이미 끝났지만 부모 프로세스가 아직 종료 상태를 회수하지 않은 상태</w:t>
+      </w:r>
+      <w:r>
+        <w:rPr>
+          <w:rFonts w:hint="eastAsia"/>
+          <w:sz w:val="18"/>
+          <w:szCs w:val="20"/>
+          <w:lang w:eastAsia="ko-KR"/>
+        </w:rPr>
+        <w:t>이다</w:t>
+      </w:r>
+      <w:r>
+        <w:rPr>
+          <w:sz w:val="18"/>
+          <w:szCs w:val="20"/>
+          <w:lang w:eastAsia="ko-KR"/>
+        </w:rPr>
+        <w:t xml:space="preserve">. 이때 PID가 Z 상태로 잠시 남을 수 있습니다. Zombie에는 이미 실행할 코드가 없으므로 SIGKILL을 다시 보내도 없어지지 </w:t>
+      </w:r>
+      <w:r>
+        <w:rPr>
+          <w:rFonts w:hint="eastAsia"/>
+          <w:sz w:val="18"/>
+          <w:szCs w:val="20"/>
+          <w:lang w:eastAsia="ko-KR"/>
+        </w:rPr>
+        <w:t>않는다.</w:t>
+      </w:r>
+    </w:p>
+    <w:p>
+      <w:pPr>
+        <w:ind w:leftChars="100" w:left="200"/>
+        <w:rPr>
+          <w:rFonts w:hint="eastAsia"/>
+          <w:sz w:val="18"/>
+          <w:szCs w:val="20"/>
           <w:lang w:eastAsia="ko-KR"/>
         </w:rPr>
       </w:pPr>
@@ -6408,7 +6596,7 @@
           </mc:Choice>
           <mc:Fallback>
             <w:pict>
-              <v:rect w14:anchorId="5630EB88" id="직사각형 1" o:spid="_x0000_s1026" style="position:absolute;margin-left:0;margin-top:-.05pt;width:493.5pt;height:34.8pt;z-index:-251649536;visibility:visible;mso-wrap-style:square;mso-width-percent:0;mso-height-percent:0;mso-wrap-distance-left:9pt;mso-wrap-distance-top:0;mso-wrap-distance-right:9pt;mso-wrap-distance-bottom:0;mso-position-horizontal:absolute;mso-position-horizontal-relative:text;mso-position-vertical:absolute;mso-position-vertical-relative:text;mso-width-percent:0;mso-height-percent:0;mso-width-relative:margin;mso-height-relative:margin;v-text-anchor:middle" o:gfxdata="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" fillcolor="white [3201]" strokecolor="black [3200]" strokeweight=".25pt"/>
+              <v:rect w14:anchorId="46076B84" id="직사각형 1" o:spid="_x0000_s1026" style="position:absolute;margin-left:0;margin-top:-.05pt;width:493.5pt;height:34.8pt;z-index:-251649536;visibility:visible;mso-wrap-style:square;mso-width-percent:0;mso-height-percent:0;mso-wrap-distance-left:9pt;mso-wrap-distance-top:0;mso-wrap-distance-right:9pt;mso-wrap-distance-bottom:0;mso-position-horizontal:absolute;mso-position-horizontal-relative:text;mso-position-vertical:absolute;mso-position-vertical-relative:text;mso-width-percent:0;mso-height-percent:0;mso-width-relative:margin;mso-height-relative:margin;v-text-anchor:middle" o:gfxdata="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" fillcolor="white [3201]" strokecolor="black [3200]" strokeweight=".25pt"/>
             </w:pict>
           </mc:Fallback>
         </mc:AlternateContent>
@@ -6528,7 +6716,7 @@
           </mc:Choice>
           <mc:Fallback>
             <w:pict>
-              <v:rect w14:anchorId="2674B8D2" id="직사각형 1" o:spid="_x0000_s1026" style="position:absolute;margin-left:0;margin-top:0;width:493.5pt;height:34.8pt;z-index:-251647488;visibility:visible;mso-wrap-style:square;mso-width-percent:0;mso-height-percent:0;mso-wrap-distance-left:9pt;mso-wrap-distance-top:0;mso-wrap-distance-right:9pt;mso-wrap-distance-bottom:0;mso-position-horizontal:absolute;mso-position-horizontal-relative:text;mso-position-vertical:absolute;mso-position-vertical-relative:text;mso-width-percent:0;mso-height-percent:0;mso-width-relative:margin;mso-height-relative:margin;v-text-anchor:middle" o:gfxdata="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" fillcolor="white [3201]" strokecolor="black [3200]" strokeweight=".25pt"/>
+              <v:rect w14:anchorId="35ED2FE5" id="직사각형 1" o:spid="_x0000_s1026" style="position:absolute;margin-left:0;margin-top:0;width:493.5pt;height:34.8pt;z-index:-251647488;visibility:visible;mso-wrap-style:square;mso-width-percent:0;mso-height-percent:0;mso-wrap-distance-left:9pt;mso-wrap-distance-top:0;mso-wrap-distance-right:9pt;mso-wrap-distance-bottom:0;mso-position-horizontal:absolute;mso-position-horizontal-relative:text;mso-position-vertical:absolute;mso-position-vertical-relative:text;mso-width-percent:0;mso-height-percent:0;mso-width-relative:margin;mso-height-relative:margin;v-text-anchor:middle" o:gfxdata="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" fillcolor="white [3201]" strokecolor="black [3200]" strokeweight=".25pt"/>
             </w:pict>
           </mc:Fallback>
         </mc:AlternateContent>
@@ -6648,7 +6836,7 @@
           </mc:Choice>
           <mc:Fallback>
             <w:pict>
-              <v:rect w14:anchorId="627F04AB" id="직사각형 1" o:spid="_x0000_s1026" style="position:absolute;margin-left:0;margin-top:0;width:493.5pt;height:34.8pt;z-index:-251645440;visibility:visible;mso-wrap-style:square;mso-width-percent:0;mso-height-percent:0;mso-wrap-distance-left:9pt;mso-wrap-distance-top:0;mso-wrap-distance-right:9pt;mso-wrap-distance-bottom:0;mso-position-horizontal:absolute;mso-position-horizontal-relative:text;mso-position-vertical:absolute;mso-position-vertical-relative:text;mso-width-percent:0;mso-height-percent:0;mso-width-relative:margin;mso-height-relative:margin;v-text-anchor:middle" o:gfxdata="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" fillcolor="white [3201]" strokecolor="black [3200]" strokeweight=".25pt"/>
+              <v:rect w14:anchorId="5BDCB1A8" id="직사각형 1" o:spid="_x0000_s1026" style="position:absolute;margin-left:0;margin-top:0;width:493.5pt;height:34.8pt;z-index:-251645440;visibility:visible;mso-wrap-style:square;mso-width-percent:0;mso-height-percent:0;mso-wrap-distance-left:9pt;mso-wrap-distance-top:0;mso-wrap-distance-right:9pt;mso-wrap-distance-bottom:0;mso-position-horizontal:absolute;mso-position-horizontal-relative:text;mso-position-vertical:absolute;mso-position-vertical-relative:text;mso-width-percent:0;mso-height-percent:0;mso-width-relative:margin;mso-height-relative:margin;v-text-anchor:middle" o:gfxdata="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" fillcolor="white [3201]" strokecolor="black [3200]" strokeweight=".25pt"/>
             </w:pict>
           </mc:Fallback>
         </mc:AlternateContent>
@@ -6663,6 +6851,7 @@
     <w:p>
       <w:pPr>
         <w:rPr>
+          <w:rFonts w:hint="eastAsia"/>
           <w:lang w:eastAsia="ko-KR"/>
         </w:rPr>
       </w:pPr>
@@ -6671,19 +6860,6 @@
           <w:lang w:eastAsia="ko-KR"/>
         </w:rPr>
         <w:t>답 _____________________________________________________________________________</w:t>
-      </w:r>
-    </w:p>
-    <w:p>
-      <w:pPr>
-        <w:rPr>
-          <w:lang w:eastAsia="ko-KR"/>
-        </w:rPr>
-      </w:pPr>
-      <w:r>
-        <w:rPr>
-          <w:lang w:eastAsia="ko-KR"/>
-        </w:rPr>
-        <w:t>.</w:t>
       </w:r>
     </w:p>
     <w:p>
@@ -9262,7 +9438,6 @@
   <w:style w:type="character" w:default="1" w:styleId="a2">
     <w:name w:val="Default Paragraph Font"/>
     <w:uiPriority w:val="1"/>
-    <w:semiHidden/>
     <w:unhideWhenUsed/>
   </w:style>
   <w:style w:type="table" w:default="1" w:styleId="a3">

</xml_diff>